<commit_message>
Add privacy policy to RDF security model
</commit_message>
<xml_diff>
--- a/deliverables/docx/Plaid_Security_Documentation_Package.docx
+++ b/deliverables/docx/Plaid_Security_Documentation_Package.docx
@@ -22748,6 +22748,289 @@
     <w:p>
       <w:r>
         <w:t>This repository's security documentation package is in [security/README.md](security/README.md).</w:t>
+      </w:r>
+    </w:p>
+    <w:p>
+      <w:r>
+        <w:br w:type="page"/>
+      </w:r>
+    </w:p>
+    <w:p>
+      <w:pPr>
+        <w:pStyle w:val="Title"/>
+      </w:pPr>
+      <w:r>
+        <w:t>Privacy Policy</w:t>
+      </w:r>
+    </w:p>
+    <w:p>
+      <w:pPr>
+        <w:pStyle w:val="Heading2"/>
+      </w:pPr>
+      <w:r>
+        <w:t>Purpose and scope</w:t>
+      </w:r>
+    </w:p>
+    <w:p>
+      <w:r>
+        <w:t>This Privacy Policy describes how the Plaid-related software documentation, demonstration integrations, and associated runtime environments represented in this repository handle personal information and financial-data-adjacent information.</w:t>
+      </w:r>
+    </w:p>
+    <w:p>
+      <w:r>
+        <w:t>The repository itself is a public code and documentation repository. Public source control is not used as a storage location for live production secrets, Plaid access tokens, or personal financial data.</w:t>
+      </w:r>
+    </w:p>
+    <w:p>
+      <w:pPr>
+        <w:pStyle w:val="Heading2"/>
+      </w:pPr>
+      <w:r>
+        <w:t>Information collected</w:t>
+      </w:r>
+    </w:p>
+    <w:p>
+      <w:pPr>
+        <w:pStyle w:val="ListBullet"/>
+      </w:pPr>
+      <w:r>
+        <w:t>Repository and collaboration metadata such as GitHub usernames, issue content, pull request content, and commit history.</w:t>
+      </w:r>
+    </w:p>
+    <w:p>
+      <w:pPr>
+        <w:pStyle w:val="ListBullet"/>
+      </w:pPr>
+      <w:r>
+        <w:t>Operational configuration values and credentials only in controlled runtime environments, not in public source control.</w:t>
+      </w:r>
+    </w:p>
+    <w:p>
+      <w:pPr>
+        <w:pStyle w:val="ListBullet"/>
+      </w:pPr>
+      <w:r>
+        <w:t>Technical logs and diagnostics needed to operate integrations, excluding secrets and raw sensitive financial payloads.</w:t>
+      </w:r>
+    </w:p>
+    <w:p>
+      <w:pPr>
+        <w:pStyle w:val="ListBullet"/>
+      </w:pPr>
+      <w:r>
+        <w:t>If a Plaid-connected runtime environment is used, limited account, transaction, balance, or token data strictly necessary to provide the integration function.</w:t>
+      </w:r>
+    </w:p>
+    <w:p>
+      <w:pPr>
+        <w:pStyle w:val="Heading2"/>
+      </w:pPr>
+      <w:r>
+        <w:t>How information is used</w:t>
+      </w:r>
+    </w:p>
+    <w:p>
+      <w:pPr>
+        <w:pStyle w:val="ListBullet"/>
+      </w:pPr>
+      <w:r>
+        <w:t>To develop, test, secure, and operate software integrations.</w:t>
+      </w:r>
+    </w:p>
+    <w:p>
+      <w:pPr>
+        <w:pStyle w:val="ListBullet"/>
+      </w:pPr>
+      <w:r>
+        <w:t>To authenticate to third-party services and maintain service availability.</w:t>
+      </w:r>
+    </w:p>
+    <w:p>
+      <w:pPr>
+        <w:pStyle w:val="ListBullet"/>
+      </w:pPr>
+      <w:r>
+        <w:t>To investigate incidents, perform debugging, and meet security obligations.</w:t>
+      </w:r>
+    </w:p>
+    <w:p>
+      <w:pPr>
+        <w:pStyle w:val="ListBullet"/>
+      </w:pPr>
+      <w:r>
+        <w:t>To comply with legal obligations or valid requests from regulators or service providers where applicable.</w:t>
+      </w:r>
+    </w:p>
+    <w:p>
+      <w:pPr>
+        <w:pStyle w:val="Heading2"/>
+      </w:pPr>
+      <w:r>
+        <w:t>Data minimization and restricted data</w:t>
+      </w:r>
+    </w:p>
+    <w:p>
+      <w:pPr>
+        <w:pStyle w:val="ListBullet"/>
+      </w:pPr>
+      <w:r>
+        <w:t>Only the minimum information necessary for the relevant integration or operational function may be processed.</w:t>
+      </w:r>
+    </w:p>
+    <w:p>
+      <w:pPr>
+        <w:pStyle w:val="ListBullet"/>
+      </w:pPr>
+      <w:r>
+        <w:t>Public repositories must not contain live Plaid credentials, access tokens, bank credentials, or raw consumer financial data.</w:t>
+      </w:r>
+    </w:p>
+    <w:p>
+      <w:pPr>
+        <w:pStyle w:val="ListBullet"/>
+      </w:pPr>
+      <w:r>
+        <w:t>Development and test environments must use synthetic, sample, or otherwise non-production financial data whenever possible.</w:t>
+      </w:r>
+    </w:p>
+    <w:p>
+      <w:pPr>
+        <w:pStyle w:val="Heading2"/>
+      </w:pPr>
+      <w:r>
+        <w:t>Sharing and subprocessors</w:t>
+      </w:r>
+    </w:p>
+    <w:p>
+      <w:r>
+        <w:t>Information may be processed by infrastructure and integration providers that support source control, cloud hosting, secret management, logging, and third-party API connectivity.</w:t>
+      </w:r>
+    </w:p>
+    <w:p>
+      <w:pPr>
+        <w:pStyle w:val="ListBullet"/>
+      </w:pPr>
+      <w:r>
+        <w:t>GitHub and GitHub Actions for source control and CI/CD.</w:t>
+      </w:r>
+    </w:p>
+    <w:p>
+      <w:pPr>
+        <w:pStyle w:val="ListBullet"/>
+      </w:pPr>
+      <w:r>
+        <w:t>Cloud providers and managed secret stores such as Google Cloud Run, GCP Secret Manager, Azure Key Vault, Azure Databricks, and documented AWS patterns.</w:t>
+      </w:r>
+    </w:p>
+    <w:p>
+      <w:pPr>
+        <w:pStyle w:val="ListBullet"/>
+      </w:pPr>
+      <w:r>
+        <w:t>Integration providers such as Plaid, Microsoft Graph, SharePoint, and Snowflake when used in runtime environments.</w:t>
+      </w:r>
+    </w:p>
+    <w:p>
+      <w:pPr>
+        <w:pStyle w:val="Heading2"/>
+      </w:pPr>
+      <w:r>
+        <w:t>Retention</w:t>
+      </w:r>
+    </w:p>
+    <w:p>
+      <w:pPr>
+        <w:pStyle w:val="ListBullet"/>
+      </w:pPr>
+      <w:r>
+        <w:t>Credentials and tokens must be rotated or deleted when no longer required.</w:t>
+      </w:r>
+    </w:p>
+    <w:p>
+      <w:pPr>
+        <w:pStyle w:val="ListBullet"/>
+      </w:pPr>
+      <w:r>
+        <w:t>Logs must be retained only for the period necessary for troubleshooting, security review, or legal obligations.</w:t>
+      </w:r>
+    </w:p>
+    <w:p>
+      <w:pPr>
+        <w:pStyle w:val="ListBullet"/>
+      </w:pPr>
+      <w:r>
+        <w:t>Any personal or financial data processed in runtime environments must be retained only for the minimum period required for the service function or legal compliance.</w:t>
+      </w:r>
+    </w:p>
+    <w:p>
+      <w:pPr>
+        <w:pStyle w:val="Heading2"/>
+      </w:pPr>
+      <w:r>
+        <w:t>Security safeguards</w:t>
+      </w:r>
+    </w:p>
+    <w:p>
+      <w:pPr>
+        <w:pStyle w:val="ListBullet"/>
+      </w:pPr>
+      <w:r>
+        <w:t>Encryption in transit is required through HTTPS or provider-managed TLS endpoints.</w:t>
+      </w:r>
+    </w:p>
+    <w:p>
+      <w:pPr>
+        <w:pStyle w:val="ListBullet"/>
+      </w:pPr>
+      <w:r>
+        <w:t>Managed secret stores or equivalent approved secure tooling must be used for production secrets.</w:t>
+      </w:r>
+    </w:p>
+    <w:p>
+      <w:pPr>
+        <w:pStyle w:val="ListBullet"/>
+      </w:pPr>
+      <w:r>
+        <w:t>Access tokens, authorization headers, private keys, and plaintext secrets must never be written to logs.</w:t>
+      </w:r>
+    </w:p>
+    <w:p>
+      <w:pPr>
+        <w:pStyle w:val="ListBullet"/>
+      </w:pPr>
+      <w:r>
+        <w:t>Plaid-connected and other financial-data-adjacent integrations must run only in controlled runtime environments.</w:t>
+      </w:r>
+    </w:p>
+    <w:p>
+      <w:pPr>
+        <w:pStyle w:val="Heading2"/>
+      </w:pPr>
+      <w:r>
+        <w:t>Your choices and requests</w:t>
+      </w:r>
+    </w:p>
+    <w:p>
+      <w:r>
+        <w:t>Requests concerning personal information, deletion, or security issues may be directed to the security contact maintained for this repository package.</w:t>
+      </w:r>
+    </w:p>
+    <w:p>
+      <w:r>
+        <w:t>Where required by law and technically feasible, reasonable efforts will be made to respond to privacy-related requests concerning data controlled by the operator.</w:t>
+      </w:r>
+    </w:p>
+    <w:p>
+      <w:pPr>
+        <w:pStyle w:val="Heading2"/>
+      </w:pPr>
+      <w:r>
+        <w:t>Policy updates</w:t>
+      </w:r>
+    </w:p>
+    <w:p>
+      <w:r>
+        <w:t>This policy may be updated after material architecture changes, integration changes, legal developments, or security incidents. The latest version published in this repository is the controlling version for this project package.</w:t>
       </w:r>
     </w:p>
     <w:sectPr>

</xml_diff>

<commit_message>
Add data retention and disposal policy
</commit_message>
<xml_diff>
--- a/deliverables/docx/Plaid_Security_Documentation_Package.docx
+++ b/deliverables/docx/Plaid_Security_Documentation_Package.docx
@@ -23031,6 +23031,415 @@
     <w:p>
       <w:r>
         <w:t>This policy may be updated after material architecture changes, integration changes, legal developments, or security incidents. The latest version published in this repository is the controlling version for this project package.</w:t>
+      </w:r>
+    </w:p>
+    <w:p>
+      <w:r>
+        <w:br w:type="page"/>
+      </w:r>
+    </w:p>
+    <w:p>
+      <w:pPr>
+        <w:pStyle w:val="Title"/>
+      </w:pPr>
+      <w:r>
+        <w:t>Data Retention and Disposal Policy</w:t>
+      </w:r>
+    </w:p>
+    <w:p>
+      <w:pPr>
+        <w:pStyle w:val="Heading2"/>
+      </w:pPr>
+      <w:r>
+        <w:t>Purpose</w:t>
+      </w:r>
+    </w:p>
+    <w:p>
+      <w:r>
+        <w:t>This policy defines retention, deletion, and disposal requirements for operational data, secrets, logs, and financial-data-adjacent information processed by systems represented in this repository package.</w:t>
+      </w:r>
+    </w:p>
+    <w:p>
+      <w:pPr>
+        <w:pStyle w:val="Heading2"/>
+      </w:pPr>
+      <w:r>
+        <w:t>Scope</w:t>
+      </w:r>
+    </w:p>
+    <w:p>
+      <w:pPr>
+        <w:pStyle w:val="ListBullet"/>
+      </w:pPr>
+      <w:r>
+        <w:t>Public repository contents, including code, issues, pull requests, and commit metadata.</w:t>
+      </w:r>
+    </w:p>
+    <w:p>
+      <w:pPr>
+        <w:pStyle w:val="ListBullet"/>
+      </w:pPr>
+      <w:r>
+        <w:t>Controlled runtime environments used for integrations such as Plaid, Microsoft Graph, SharePoint, Snowflake, and similar services.</w:t>
+      </w:r>
+    </w:p>
+    <w:p>
+      <w:pPr>
+        <w:pStyle w:val="ListBullet"/>
+      </w:pPr>
+      <w:r>
+        <w:t>Secrets, tokens, logs, diagnostics, and configuration data managed outside public source control.</w:t>
+      </w:r>
+    </w:p>
+    <w:p>
+      <w:pPr>
+        <w:pStyle w:val="Heading2"/>
+      </w:pPr>
+      <w:r>
+        <w:t>Retention principles</w:t>
+      </w:r>
+    </w:p>
+    <w:p>
+      <w:pPr>
+        <w:pStyle w:val="ListBullet"/>
+      </w:pPr>
+      <w:r>
+        <w:t>Information must be retained only for the minimum period necessary to support the documented service function, security operations, or legal obligations.</w:t>
+      </w:r>
+    </w:p>
+    <w:p>
+      <w:pPr>
+        <w:pStyle w:val="ListBullet"/>
+      </w:pPr>
+      <w:r>
+        <w:t>Sensitive financial or personal data must not be retained solely for convenience.</w:t>
+      </w:r>
+    </w:p>
+    <w:p>
+      <w:pPr>
+        <w:pStyle w:val="ListBullet"/>
+      </w:pPr>
+      <w:r>
+        <w:t>Public repositories must not be used as an archival location for live customer data, Plaid tokens, bank credentials, or other restricted data.</w:t>
+      </w:r>
+    </w:p>
+    <w:p>
+      <w:pPr>
+        <w:pStyle w:val="Heading2"/>
+      </w:pPr>
+      <w:r>
+        <w:t>Retention requirements by data type</w:t>
+      </w:r>
+    </w:p>
+    <w:tbl>
+      <w:tblPr>
+        <w:tblStyle w:val="TableGrid"/>
+        <w:tblW w:type="auto" w:w="0"/>
+        <w:tblLayout w:type="autofit"/>
+        <w:tblLook w:firstColumn="1" w:firstRow="1" w:lastColumn="0" w:lastRow="0" w:noHBand="0" w:noVBand="1" w:val="04A0"/>
+      </w:tblPr>
+      <w:tblGrid>
+        <w:gridCol w:w="5040"/>
+        <w:gridCol w:w="5040"/>
+      </w:tblGrid>
+      <w:tr>
+        <w:tc>
+          <w:tcPr>
+            <w:tcW w:type="dxa" w:w="5040"/>
+            <w:vAlign w:val="top"/>
+          </w:tcPr>
+          <w:p>
+            <w:r>
+              <w:rPr>
+                <w:rFonts w:ascii="Aptos" w:hAnsi="Aptos"/>
+                <w:b/>
+                <w:sz w:val="18"/>
+              </w:rPr>
+              <w:t>Data Type</w:t>
+            </w:r>
+          </w:p>
+        </w:tc>
+        <w:tc>
+          <w:tcPr>
+            <w:tcW w:type="dxa" w:w="5040"/>
+            <w:vAlign w:val="top"/>
+          </w:tcPr>
+          <w:p>
+            <w:r>
+              <w:rPr>
+                <w:rFonts w:ascii="Aptos" w:hAnsi="Aptos"/>
+                <w:b/>
+                <w:sz w:val="18"/>
+              </w:rPr>
+              <w:t>Retention Rule</w:t>
+            </w:r>
+          </w:p>
+        </w:tc>
+      </w:tr>
+      <w:tr>
+        <w:tc>
+          <w:tcPr>
+            <w:tcW w:type="dxa" w:w="5040"/>
+            <w:vAlign w:val="top"/>
+          </w:tcPr>
+          <w:p>
+            <w:r>
+              <w:rPr>
+                <w:rFonts w:ascii="Aptos" w:hAnsi="Aptos"/>
+                <w:sz w:val="18"/>
+              </w:rPr>
+              <w:t>Secrets and access tokens</w:t>
+            </w:r>
+          </w:p>
+        </w:tc>
+        <w:tc>
+          <w:tcPr>
+            <w:tcW w:type="dxa" w:w="5040"/>
+            <w:vAlign w:val="top"/>
+          </w:tcPr>
+          <w:p>
+            <w:r>
+              <w:rPr>
+                <w:rFonts w:ascii="Aptos" w:hAnsi="Aptos"/>
+                <w:sz w:val="18"/>
+              </w:rPr>
+              <w:t>Retain only while operationally required; rotate or delete immediately when no longer needed or on suspected compromise.</w:t>
+            </w:r>
+          </w:p>
+        </w:tc>
+      </w:tr>
+      <w:tr>
+        <w:tc>
+          <w:tcPr>
+            <w:tcW w:type="dxa" w:w="5040"/>
+            <w:vAlign w:val="top"/>
+          </w:tcPr>
+          <w:p>
+            <w:r>
+              <w:rPr>
+                <w:rFonts w:ascii="Aptos" w:hAnsi="Aptos"/>
+                <w:sz w:val="18"/>
+              </w:rPr>
+              <w:t>Application and infrastructure logs</w:t>
+            </w:r>
+          </w:p>
+        </w:tc>
+        <w:tc>
+          <w:tcPr>
+            <w:tcW w:type="dxa" w:w="5040"/>
+            <w:vAlign w:val="top"/>
+          </w:tcPr>
+          <w:p>
+            <w:r>
+              <w:rPr>
+                <w:rFonts w:ascii="Aptos" w:hAnsi="Aptos"/>
+                <w:sz w:val="18"/>
+              </w:rPr>
+              <w:t>Retain only as long as needed for troubleshooting, monitoring, incident response, or legal obligations.</w:t>
+            </w:r>
+          </w:p>
+        </w:tc>
+      </w:tr>
+      <w:tr>
+        <w:tc>
+          <w:tcPr>
+            <w:tcW w:type="dxa" w:w="5040"/>
+            <w:vAlign w:val="top"/>
+          </w:tcPr>
+          <w:p>
+            <w:r>
+              <w:rPr>
+                <w:rFonts w:ascii="Aptos" w:hAnsi="Aptos"/>
+                <w:sz w:val="18"/>
+              </w:rPr>
+              <w:t>Sample or synthetic test data</w:t>
+            </w:r>
+          </w:p>
+        </w:tc>
+        <w:tc>
+          <w:tcPr>
+            <w:tcW w:type="dxa" w:w="5040"/>
+            <w:vAlign w:val="top"/>
+          </w:tcPr>
+          <w:p>
+            <w:r>
+              <w:rPr>
+                <w:rFonts w:ascii="Aptos" w:hAnsi="Aptos"/>
+                <w:sz w:val="18"/>
+              </w:rPr>
+              <w:t>Retain only while needed for development or validation.</w:t>
+            </w:r>
+          </w:p>
+        </w:tc>
+      </w:tr>
+      <w:tr>
+        <w:tc>
+          <w:tcPr>
+            <w:tcW w:type="dxa" w:w="5040"/>
+            <w:vAlign w:val="top"/>
+          </w:tcPr>
+          <w:p>
+            <w:r>
+              <w:rPr>
+                <w:rFonts w:ascii="Aptos" w:hAnsi="Aptos"/>
+                <w:sz w:val="18"/>
+              </w:rPr>
+              <w:t>Production financial or personal data</w:t>
+            </w:r>
+          </w:p>
+        </w:tc>
+        <w:tc>
+          <w:tcPr>
+            <w:tcW w:type="dxa" w:w="5040"/>
+            <w:vAlign w:val="top"/>
+          </w:tcPr>
+          <w:p>
+            <w:r>
+              <w:rPr>
+                <w:rFonts w:ascii="Aptos" w:hAnsi="Aptos"/>
+                <w:sz w:val="18"/>
+              </w:rPr>
+              <w:t>Retain only for the minimum period required for service delivery, contractual obligations, or legal compliance.</w:t>
+            </w:r>
+          </w:p>
+        </w:tc>
+      </w:tr>
+      <w:tr>
+        <w:tc>
+          <w:tcPr>
+            <w:tcW w:type="dxa" w:w="5040"/>
+            <w:vAlign w:val="top"/>
+          </w:tcPr>
+          <w:p>
+            <w:r>
+              <w:rPr>
+                <w:rFonts w:ascii="Aptos" w:hAnsi="Aptos"/>
+                <w:sz w:val="18"/>
+              </w:rPr>
+              <w:t>Backups containing sensitive data</w:t>
+            </w:r>
+          </w:p>
+        </w:tc>
+        <w:tc>
+          <w:tcPr>
+            <w:tcW w:type="dxa" w:w="5040"/>
+            <w:vAlign w:val="top"/>
+          </w:tcPr>
+          <w:p>
+            <w:r>
+              <w:rPr>
+                <w:rFonts w:ascii="Aptos" w:hAnsi="Aptos"/>
+                <w:sz w:val="18"/>
+              </w:rPr>
+              <w:t>Retain only according to backup and recovery requirements and securely delete when expired.</w:t>
+            </w:r>
+          </w:p>
+        </w:tc>
+      </w:tr>
+    </w:tbl>
+    <w:p/>
+    <w:p>
+      <w:pPr>
+        <w:pStyle w:val="Heading2"/>
+      </w:pPr>
+      <w:r>
+        <w:t>Disposal and deletion requirements</w:t>
+      </w:r>
+    </w:p>
+    <w:p>
+      <w:pPr>
+        <w:pStyle w:val="ListBullet"/>
+      </w:pPr>
+      <w:r>
+        <w:t>Expired or no-longer-required secrets must be deleted or rotated from managed secret stores and dependent systems.</w:t>
+      </w:r>
+    </w:p>
+    <w:p>
+      <w:pPr>
+        <w:pStyle w:val="ListBullet"/>
+      </w:pPr>
+      <w:r>
+        <w:t>Logs and exported data sets reaching the end of their retention period must be securely deleted from managed storage where supported by the platform.</w:t>
+      </w:r>
+    </w:p>
+    <w:p>
+      <w:pPr>
+        <w:pStyle w:val="ListBullet"/>
+      </w:pPr>
+      <w:r>
+        <w:t>Temporary files, test exports, and local copies containing sensitive data must be deleted promptly after use.</w:t>
+      </w:r>
+    </w:p>
+    <w:p>
+      <w:pPr>
+        <w:pStyle w:val="ListBullet"/>
+      </w:pPr>
+      <w:r>
+        <w:t>If storage media or systems are decommissioned, provider-managed destruction or secure wipe processes must be used where applicable.</w:t>
+      </w:r>
+    </w:p>
+    <w:p>
+      <w:pPr>
+        <w:pStyle w:val="Heading2"/>
+      </w:pPr>
+      <w:r>
+        <w:t>Plaid-specific requirements</w:t>
+      </w:r>
+    </w:p>
+    <w:p>
+      <w:pPr>
+        <w:pStyle w:val="ListBullet"/>
+      </w:pPr>
+      <w:r>
+        <w:t>Plaid access tokens, item identifiers, and retrieved account or transaction data must remain outside public source control at all times.</w:t>
+      </w:r>
+    </w:p>
+    <w:p>
+      <w:pPr>
+        <w:pStyle w:val="ListBullet"/>
+      </w:pPr>
+      <w:r>
+        <w:t>Plaid-related financial data must be retained only for the period necessary to provide the integration function or satisfy legal obligations.</w:t>
+      </w:r>
+    </w:p>
+    <w:p>
+      <w:pPr>
+        <w:pStyle w:val="ListBullet"/>
+      </w:pPr>
+      <w:r>
+        <w:t>On account disconnect, credential rotation, or confirmed compromise, affected Plaid tokens and related cached data must be revoked or deleted as soon as practical.</w:t>
+      </w:r>
+    </w:p>
+    <w:p>
+      <w:pPr>
+        <w:pStyle w:val="Heading2"/>
+      </w:pPr>
+      <w:r>
+        <w:t>Review cadence</w:t>
+      </w:r>
+    </w:p>
+    <w:p>
+      <w:pPr>
+        <w:pStyle w:val="ListBullet"/>
+      </w:pPr>
+      <w:r>
+        <w:t>This policy must be reviewed at least annually.</w:t>
+      </w:r>
+    </w:p>
+    <w:p>
+      <w:pPr>
+        <w:pStyle w:val="ListBullet"/>
+      </w:pPr>
+      <w:r>
+        <w:t>This policy must be reviewed after any material architecture change, integration change, or security incident affecting retained data.</w:t>
+      </w:r>
+    </w:p>
+    <w:p>
+      <w:pPr>
+        <w:pStyle w:val="ListBullet"/>
+      </w:pPr>
+      <w:r>
+        <w:t>High-risk integrations must be reviewed at least quarterly for retention and disposal compliance.</w:t>
       </w:r>
     </w:p>
     <w:sectPr>

</xml_diff>